<commit_message>
Corrige a ordem da Skill e estabiliza a geracao do docx
Co-Authored-By: Claude Opus 5 <noreply@anthropic.com>
</commit_message>
<xml_diff>
--- a/coluna/2026-09-22.docx
+++ b/coluna/2026-09-22.docx
@@ -4,7 +4,7 @@
   <w:body>
     <w:p>
       <w:pPr>
-        <w:spacing w:after="60"/>
+        <w:spacing w:after="120"/>
       </w:pPr>
       <w:r>
         <w:rPr>
@@ -18,120 +18,115 @@
     </w:p>
     <w:p>
       <w:pPr>
+        <w:spacing w:after="240"/>
+      </w:pPr>
+      <w:r>
+        <w:rPr>
+          <w:color w:val="808080"/>
+          <w:sz w:val="22"/>
+          <w:szCs w:val="22"/>
+        </w:rPr>
+        <w:t xml:space="preserve">22 de setembro de 2026</w:t>
+      </w:r>
+    </w:p>
+    <w:p>
+      <w:pPr>
+        <w:spacing w:after="200"/>
+      </w:pPr>
+      <w:r>
+        <w:rPr>
+          <w:sz w:val="22"/>
+          <w:szCs w:val="22"/>
+        </w:rPr>
+        <w:t xml:space="preserve">A Microsoft soltou IA no time de vendas e o uso despencou.</w:t>
+      </w:r>
+    </w:p>
+    <w:p>
+      <w:pPr>
+        <w:spacing w:after="200"/>
+      </w:pPr>
+      <w:r>
+        <w:rPr>
+          <w:sz w:val="22"/>
+          <w:szCs w:val="22"/>
+        </w:rPr>
+        <w:t xml:space="preserve">A Harvard Business Review contou, em maio de 2026, no podcast Cold Call, o que houve na MCAPS, a organização de vendas da empresa, 62 mil pessoas. Em um mês, a adoção caiu de 22% para 5%. Ninguém sabotou nada. Só ninguém sabia para que aquilo servia.</w:t>
+      </w:r>
+    </w:p>
+    <w:p>
+      <w:pPr>
+        <w:spacing w:after="200"/>
+      </w:pPr>
+      <w:r>
+        <w:rPr>
+          <w:sz w:val="22"/>
+          <w:szCs w:val="22"/>
+        </w:rPr>
+        <w:t xml:space="preserve">Iav Bojinov, professor em Harvard, resumiu: é uma ferramenta de IA de uso geral, mas ninguém diz a você o que fazer com ela. "Uso geral" é o jeito elegante de dizer "vire-se".</w:t>
+      </w:r>
+    </w:p>
+    <w:p>
+      <w:pPr>
+        <w:spacing w:after="200"/>
+      </w:pPr>
+      <w:r>
+        <w:rPr>
+          <w:sz w:val="22"/>
+          <w:szCs w:val="22"/>
+        </w:rPr>
+        <w:t xml:space="preserve">Dois anos de ajustes depois, o uso diário passou de 60% e o mensal, de 98%. A parte difícil nunca foi o modelo. Era a rotina.</w:t>
+      </w:r>
+    </w:p>
+    <w:p>
+      <w:pPr>
+        <w:spacing w:after="200"/>
+      </w:pPr>
+      <w:r>
+        <w:rPr>
+          <w:sz w:val="22"/>
+          <w:szCs w:val="22"/>
+        </w:rPr>
+        <w:t xml:space="preserve">Enquanto isso, a Default ouviu mais de 300 líderes de RevOps, a turma que cuida dos dados e processos por trás da venda, e 71% se dão nota 7 ou mais em IA. Menos de 10% veem o dinheiro voltar, e a maioria economiza menos de cinco horas por semana.</w:t>
+      </w:r>
+    </w:p>
+    <w:p>
+      <w:pPr>
+        <w:spacing w:after="200"/>
+      </w:pPr>
+      <w:r>
+        <w:rPr>
+          <w:sz w:val="22"/>
+          <w:szCs w:val="22"/>
+        </w:rPr>
+        <w:t xml:space="preserve">Autoconfiança em alta, retorno em obras.</w:t>
+      </w:r>
+    </w:p>
+    <w:p>
+      <w:pPr>
         <w:spacing w:after="0"/>
       </w:pPr>
       <w:r>
         <w:rPr>
-          <w:color w:val="808080"/>
           <w:sz w:val="20"/>
           <w:szCs w:val="20"/>
         </w:rPr>
-        <w:t xml:space="preserve">22 de setembro de 2026</w:t>
-      </w:r>
-    </w:p>
-    <w:p>
-      <w:r>
-        <w:t xml:space="preserve"/>
-      </w:r>
-    </w:p>
-    <w:p>
-      <w:pPr>
-        <w:spacing w:after="200"/>
-      </w:pPr>
-      <w:r>
-        <w:rPr>
-          <w:sz w:val="22"/>
-          <w:szCs w:val="22"/>
-        </w:rPr>
-        <w:t xml:space="preserve">A Microsoft soltou IA no time de vendas e o uso despencou.</w:t>
-      </w:r>
-    </w:p>
-    <w:p>
-      <w:pPr>
-        <w:spacing w:after="200"/>
-      </w:pPr>
-      <w:r>
-        <w:rPr>
-          <w:sz w:val="22"/>
-          <w:szCs w:val="22"/>
-        </w:rPr>
-        <w:t xml:space="preserve">A Harvard Business Review contou, em maio de 2026, no podcast Cold Call, o que houve na MCAPS, a organização de vendas da empresa, 62 mil pessoas. Em um mês, a adoção caiu de 22% para 5%. Ninguém sabotou nada. Só ninguém sabia para que aquilo servia.</w:t>
-      </w:r>
-    </w:p>
-    <w:p>
-      <w:pPr>
-        <w:spacing w:after="200"/>
-      </w:pPr>
-      <w:r>
-        <w:rPr>
-          <w:sz w:val="22"/>
-          <w:szCs w:val="22"/>
-        </w:rPr>
-        <w:t xml:space="preserve">Iav Bojinov, professor em Harvard, resumiu: é uma ferramenta de IA de uso geral, mas ninguém diz a você o que fazer com ela. “Uso geral” é o jeito elegante de dizer “vire-se”.</w:t>
-      </w:r>
-    </w:p>
-    <w:p>
-      <w:pPr>
-        <w:spacing w:after="200"/>
-      </w:pPr>
-      <w:r>
-        <w:rPr>
-          <w:sz w:val="22"/>
-          <w:szCs w:val="22"/>
-        </w:rPr>
-        <w:t xml:space="preserve">Dois anos de ajustes depois, o uso diário passou de 60% e o mensal, de 98%. A parte difícil nunca foi o modelo. Era a rotina.</w:t>
-      </w:r>
-    </w:p>
-    <w:p>
-      <w:pPr>
-        <w:spacing w:after="200"/>
-      </w:pPr>
-      <w:r>
-        <w:rPr>
-          <w:sz w:val="22"/>
-          <w:szCs w:val="22"/>
-        </w:rPr>
-        <w:t xml:space="preserve">Enquanto isso, a Default ouviu mais de 300 líderes de RevOps, a turma que cuida dos dados e processos por trás da venda, e 71% se dão nota 7 ou mais em IA. Menos de 10% veem o dinheiro voltar, e a maioria economiza menos de cinco horas por semana.</w:t>
-      </w:r>
-    </w:p>
-    <w:p>
-      <w:pPr>
-        <w:spacing w:after="200"/>
-      </w:pPr>
-      <w:r>
-        <w:rPr>
-          <w:sz w:val="22"/>
-          <w:szCs w:val="22"/>
-        </w:rPr>
-        <w:t xml:space="preserve">Autoconfiança em alta, retorno em obras.</w:t>
-      </w:r>
-    </w:p>
-    <w:p>
-      <w:pPr>
-        <w:spacing w:before="200" w:after="0"/>
+        <w:t xml:space="preserve">Fonte (Harvard Business Review): https://hbr.org/podcast/2026/05/microsofts-path-to-adopting-and-scaling-ai-across-its-sales-organization</w:t>
+      </w:r>
+    </w:p>
+    <w:p>
+      <w:pPr>
+        <w:spacing w:after="0"/>
       </w:pPr>
       <w:r>
         <w:rPr>
           <w:sz w:val="20"/>
           <w:szCs w:val="20"/>
         </w:rPr>
-        <w:t xml:space="preserve">Fonte (Harvard Business Review): https://hbr.org/podcast/2026/05/microsofts-path-to-adopting-and-scaling-ai-across-its-sales-organization</w:t>
-      </w:r>
-    </w:p>
-    <w:p>
-      <w:pPr>
-        <w:spacing w:before="0"/>
-      </w:pPr>
-      <w:r>
-        <w:rPr>
-          <w:sz w:val="20"/>
-          <w:szCs w:val="20"/>
-        </w:rPr>
         <w:t xml:space="preserve">Fonte (Default): https://www.default.com/post/ai-2026-part-1</w:t>
       </w:r>
     </w:p>
     <w:sectPr>
-      <w:pgSz w:w="12240" w:h="15840" w:orient="portrait"/>
+      <w:pgSz w:w="11906" w:h="16838" w:orient="portrait"/>
       <w:pgMar w:top="1440" w:right="1440" w:bottom="1440" w:left="1440" w:header="708" w:footer="708" w:gutter="0"/>
       <w:pgNumType/>
       <w:docGrid w:linePitch="360"/>

</xml_diff>